<commit_message>
chore: changed webador section
</commit_message>
<xml_diff>
--- a/assets/David Constantin CV.docx
+++ b/assets/David Constantin CV.docx
@@ -288,7 +288,7 @@
         <w:ind w:left="605" w:hanging="288"/>
       </w:pPr>
       <w:r>
-        <w:t>Contributed to feature creation, bug fixes and creating tests for a large monolithic PHP code-base built on Laminas.</w:t>
+        <w:t>Shipped features to production in a large PHP monolith built on Laminas, on a platform that grew from 50,000 to 130,000 active subscribers while I was there.</w:t>
       </w:r>
     </w:p>
     <w:p>
@@ -298,7 +298,7 @@
         <w:ind w:left="605" w:hanging="288"/>
       </w:pPr>
       <w:r>
-        <w:t>Focused on features related to domain creation, internationalization, AI, security and API design.</w:t>
+        <w:t>Built domain registration and DNS record management against registrar APIs, including a custom service for top-level domain parsing.</w:t>
       </w:r>
     </w:p>
     <w:p>
@@ -308,7 +308,27 @@
         <w:ind w:left="605" w:hanging="288"/>
       </w:pPr>
       <w:r>
-        <w:t>Took part in key processes as part of a large team of developers.</w:t>
+        <w:t>Handled internationalization for several markets, including postcode formats, language and German compliance requirements.</w:t>
+      </w:r>
+    </w:p>
+    <w:p>
+      <w:pPr>
+        <w:pStyle w:val="ListBullet"/>
+        <w:spacing w:after="0"/>
+        <w:ind w:left="605" w:hanging="288"/>
+      </w:pPr>
+      <w:r>
+        <w:t>Built features with security in mind, backed by unit and integration tests.</w:t>
+      </w:r>
+    </w:p>
+    <w:p>
+      <w:pPr>
+        <w:pStyle w:val="ListBullet"/>
+        <w:spacing w:after="0"/>
+        <w:ind w:left="605" w:hanging="288"/>
+      </w:pPr>
+      <w:r>
+        <w:t>Migrated the end-to-end test suite from Dutch to English.</w:t>
       </w:r>
     </w:p>
     <w:p>

</xml_diff>

<commit_message>
chore: update pdf with data
</commit_message>
<xml_diff>
--- a/assets/David Constantin CV.docx
+++ b/assets/David Constantin CV.docx
@@ -21,7 +21,7 @@
         <w:jc w:val="center"/>
       </w:pPr>
       <w:r>
-        <w:t>Rotterdam, The Netherlands| P: +40773326311| dvdkonstantin@gmail.com |personal website</w:t>
+        <w:t>Rijswijk, The Netherlands| P: +40773326311| dvdkonstantin@gmail.com |personal website</w:t>
       </w:r>
     </w:p>
     <w:p>
@@ -177,7 +177,7 @@
       </w:r>
       <w:r>
         <w:tab/>
-        <w:t>May 2025 – Present</w:t>
+        <w:t>Jun 2025 – Present</w:t>
       </w:r>
     </w:p>
     <w:p>

</xml_diff>